<commit_message>
updating structure from notes on C6
</commit_message>
<xml_diff>
--- a/roboticDevelopEnv/work/Chap6AdvanceNotes.docx
+++ b/roboticDevelopEnv/work/Chap6AdvanceNotes.docx
@@ -7,7 +7,6 @@
         <w:t xml:space="preserve">Notes about chap6 from RVC v2 </w:t>
       </w:r>
     </w:p>
-    <w:p/>
     <w:p>
       <w:r>
         <w:t xml:space="preserve">LOCALIZATION AND MAPPING </w:t>
@@ -24,11 +23,651 @@
         <w:t xml:space="preserve"> </w:t>
       </w:r>
     </w:p>
-    <w:p/>
-    <w:p>
+    <w:p>
+      <w:r>
+        <w:t>Dead reckoning is the estimation of position based on estimated speed, direction</w:t>
+      </w:r>
+    </w:p>
+    <w:p>
+      <w:r>
+        <w:t>and time of travel with respect to a previous estimate</w:t>
+      </w:r>
+      <w:r>
+        <w:t xml:space="preserve">, using elementary geometry. </w:t>
+      </w:r>
+    </w:p>
+    <w:p>
+      <w:r>
+        <w:drawing>
+          <wp:inline distT="0" distB="0" distL="0" distR="0" wp14:anchorId="052F3775" wp14:editId="1720634F">
+            <wp:extent cx="5410200" cy="2608596"/>
+            <wp:effectExtent l="0" t="0" r="0" b="1270"/>
+            <wp:docPr id="125380360" name="Imagen 1" descr="Gráfico, Gráfico de líneas&#10;&#10;El contenido generado por IA puede ser incorrecto."/>
+            <wp:cNvGraphicFramePr>
+              <a:graphicFrameLocks xmlns:a="http://schemas.openxmlformats.org/drawingml/2006/main" noChangeAspect="1"/>
+            </wp:cNvGraphicFramePr>
+            <a:graphic xmlns:a="http://schemas.openxmlformats.org/drawingml/2006/main">
+              <a:graphicData uri="http://schemas.openxmlformats.org/drawingml/2006/picture">
+                <pic:pic xmlns:pic="http://schemas.openxmlformats.org/drawingml/2006/picture">
+                  <pic:nvPicPr>
+                    <pic:cNvPr id="125380360" name="Imagen 1" descr="Gráfico, Gráfico de líneas&#10;&#10;El contenido generado por IA puede ser incorrecto."/>
+                    <pic:cNvPicPr/>
+                  </pic:nvPicPr>
+                  <pic:blipFill>
+                    <a:blip r:embed="rId5"/>
+                    <a:stretch>
+                      <a:fillRect/>
+                    </a:stretch>
+                  </pic:blipFill>
+                  <pic:spPr>
+                    <a:xfrm>
+                      <a:off x="0" y="0"/>
+                      <a:ext cx="5411888" cy="2609410"/>
+                    </a:xfrm>
+                    <a:prstGeom prst="rect">
+                      <a:avLst/>
+                    </a:prstGeom>
+                  </pic:spPr>
+                </pic:pic>
+              </a:graphicData>
+            </a:graphic>
+          </wp:inline>
+        </w:drawing>
+      </w:r>
+    </w:p>
+    <w:p>
+      <w:pPr>
+        <w:numPr>
+          <w:ilvl w:val="0"/>
+          <w:numId w:val="2"/>
+        </w:numPr>
+      </w:pPr>
+      <w:r>
+        <w:t>Dead reckoning relies on continuous updates of position based on movement estimates.</w:t>
+      </w:r>
+    </w:p>
+    <w:p>
+      <w:pPr>
+        <w:numPr>
+          <w:ilvl w:val="0"/>
+          <w:numId w:val="2"/>
+        </w:numPr>
+      </w:pPr>
+      <w:r>
+        <w:t>It accumulates errors over time due to systematic and random inaccuracies in measurements.</w:t>
+      </w:r>
+    </w:p>
+    <w:p>
+      <w:pPr>
+        <w:numPr>
+          <w:ilvl w:val="0"/>
+          <w:numId w:val="2"/>
+        </w:numPr>
+      </w:pPr>
+      <w:r>
+        <w:t>Historically used for navigation before GPS, it remains relevant for robots operating in environments without GPS.</w:t>
+      </w:r>
+    </w:p>
+    <w:p/>
+    <w:p>
+      <w:r>
+        <w:t xml:space="preserve">Landmark </w:t>
+      </w:r>
+      <w:proofErr w:type="gramStart"/>
+      <w:r>
+        <w:t>map :</w:t>
+      </w:r>
+      <w:proofErr w:type="gramEnd"/>
+      <w:r>
+        <w:t xml:space="preserve"> </w:t>
+      </w:r>
+      <w:r>
+        <w:br/>
+      </w:r>
+    </w:p>
+    <w:p>
+      <w:r>
+        <w:t>A landmark is a visible feature in the environment whose position is known</w:t>
+      </w:r>
+    </w:p>
+    <w:p>
+      <w:r>
+        <w:t>with respect to some coordinate frame</w:t>
+      </w:r>
+      <w:r>
+        <w:t xml:space="preserve">. SEE A MAP AND A NUMBER OF LIGHTHOUSE </w:t>
+      </w:r>
+      <w:proofErr w:type="gramStart"/>
+      <w:r>
+        <w:t>LANDMARKS :</w:t>
+      </w:r>
+      <w:proofErr w:type="gramEnd"/>
+      <w:r>
+        <w:t xml:space="preserve"> </w:t>
+      </w:r>
+    </w:p>
+    <w:p>
+      <w:r>
+        <w:lastRenderedPageBreak/>
+        <w:drawing>
+          <wp:inline distT="0" distB="0" distL="0" distR="0" wp14:anchorId="0F546D3A" wp14:editId="29A05A37">
+            <wp:extent cx="5455920" cy="2366010"/>
+            <wp:effectExtent l="0" t="0" r="0" b="0"/>
+            <wp:docPr id="1962081992" name="Imagen 1" descr="Gráfico&#10;&#10;El contenido generado por IA puede ser incorrecto."/>
+            <wp:cNvGraphicFramePr>
+              <a:graphicFrameLocks xmlns:a="http://schemas.openxmlformats.org/drawingml/2006/main" noChangeAspect="1"/>
+            </wp:cNvGraphicFramePr>
+            <a:graphic xmlns:a="http://schemas.openxmlformats.org/drawingml/2006/main">
+              <a:graphicData uri="http://schemas.openxmlformats.org/drawingml/2006/picture">
+                <pic:pic xmlns:pic="http://schemas.openxmlformats.org/drawingml/2006/picture">
+                  <pic:nvPicPr>
+                    <pic:cNvPr id="1962081992" name="Imagen 1" descr="Gráfico&#10;&#10;El contenido generado por IA puede ser incorrecto."/>
+                    <pic:cNvPicPr/>
+                  </pic:nvPicPr>
+                  <pic:blipFill>
+                    <a:blip r:embed="rId6"/>
+                    <a:stretch>
+                      <a:fillRect/>
+                    </a:stretch>
+                  </pic:blipFill>
+                  <pic:spPr>
+                    <a:xfrm>
+                      <a:off x="0" y="0"/>
+                      <a:ext cx="5462891" cy="2369033"/>
+                    </a:xfrm>
+                    <a:prstGeom prst="rect">
+                      <a:avLst/>
+                    </a:prstGeom>
+                  </pic:spPr>
+                </pic:pic>
+              </a:graphicData>
+            </a:graphic>
+          </wp:inline>
+        </w:drawing>
+      </w:r>
+    </w:p>
+    <w:p/>
+    <w:p>
+      <w:pPr>
+        <w:numPr>
+          <w:ilvl w:val="0"/>
+          <w:numId w:val="3"/>
+        </w:numPr>
+      </w:pPr>
+      <w:r>
+        <w:t xml:space="preserve">This figure demonstrates how landmarks can be used to localize a robot or vessel. It shows two lighthouses (A and </w:t>
+      </w:r>
+      <w:proofErr w:type="gramStart"/>
+      <w:r>
+        <w:t>C )</w:t>
+      </w:r>
+      <w:proofErr w:type="gramEnd"/>
+      <w:r>
+        <w:t xml:space="preserve"> and their corresponding positions on a map.</w:t>
+      </w:r>
+    </w:p>
+    <w:p>
+      <w:pPr>
+        <w:numPr>
+          <w:ilvl w:val="1"/>
+          <w:numId w:val="3"/>
+        </w:numPr>
+      </w:pPr>
+      <w:r>
+        <w:t>By measuring the bearing angles to these landmarks, the robot can triangulate its position.</w:t>
+      </w:r>
+    </w:p>
+    <w:p>
+      <w:pPr>
+        <w:numPr>
+          <w:ilvl w:val="1"/>
+          <w:numId w:val="3"/>
+        </w:numPr>
+      </w:pPr>
+      <w:r>
+        <w:t xml:space="preserve">If the wrong landmark is identified (e.g., mistaking B for </w:t>
+      </w:r>
+      <w:proofErr w:type="gramStart"/>
+      <w:r>
+        <w:t>C )</w:t>
+      </w:r>
+      <w:proofErr w:type="gramEnd"/>
+      <w:r>
+        <w:t>, the estimated position (</w:t>
+      </w:r>
+      <w:proofErr w:type="gramStart"/>
+      <w:r>
+        <w:t>q )</w:t>
+      </w:r>
+      <w:proofErr w:type="gramEnd"/>
+      <w:r>
+        <w:t xml:space="preserve"> will be incorrect.</w:t>
+      </w:r>
+    </w:p>
+    <w:p>
+      <w:pPr>
+        <w:numPr>
+          <w:ilvl w:val="2"/>
+          <w:numId w:val="3"/>
+        </w:numPr>
+      </w:pPr>
+      <w:r>
+        <w:t>Landmarks provide additional information to correct dead-reckoning estimates.</w:t>
+      </w:r>
+    </w:p>
+    <w:p>
+      <w:pPr>
+        <w:numPr>
+          <w:ilvl w:val="2"/>
+          <w:numId w:val="3"/>
+        </w:numPr>
+      </w:pPr>
+      <w:r>
+        <w:t>Triangulation requires accurate identification of landmarks and precise measurement of bearing angles.</w:t>
+      </w:r>
+    </w:p>
+    <w:p>
+      <w:pPr>
+        <w:numPr>
+          <w:ilvl w:val="2"/>
+          <w:numId w:val="3"/>
+        </w:numPr>
+      </w:pPr>
+      <w:r>
+        <w:t xml:space="preserve">Errors in landmark identification or measurement </w:t>
+      </w:r>
+      <w:proofErr w:type="gramStart"/>
+      <w:r>
+        <w:t>lead</w:t>
+      </w:r>
+      <w:proofErr w:type="gramEnd"/>
+      <w:r>
+        <w:t xml:space="preserve"> to significant localization errors.</w:t>
+      </w:r>
+    </w:p>
+    <w:p/>
+    <w:p>
+      <w:proofErr w:type="gramStart"/>
+      <w:r>
+        <w:t>RESECTIONING :</w:t>
+      </w:r>
+      <w:proofErr w:type="gramEnd"/>
+      <w:r>
+        <w:t xml:space="preserve"> </w:t>
+      </w:r>
+      <w:r>
+        <w:t>estimation of</w:t>
+      </w:r>
+      <w:r>
+        <w:t xml:space="preserve"> </w:t>
+      </w:r>
+      <w:r>
+        <w:t>position by measuring the bearing</w:t>
+      </w:r>
+      <w:r>
+        <w:t xml:space="preserve"> </w:t>
+      </w:r>
+      <w:r>
+        <w:t>angles to known</w:t>
+      </w:r>
+    </w:p>
+    <w:p>
+      <w:r>
+        <w:t>landmarks</w:t>
+      </w:r>
+    </w:p>
+    <w:p/>
+    <w:p>
+      <w:proofErr w:type="gramStart"/>
+      <w:r>
+        <w:t>TRIANGULATION :</w:t>
+      </w:r>
+      <w:proofErr w:type="gramEnd"/>
+      <w:r>
+        <w:rPr>
+          <w:rFonts w:ascii="BrdqnmTimes-Roman" w:hAnsi="BrdqnmTimes-Roman" w:cs="BrdqnmTimes-Roman"/>
+          <w:kern w:val="0"/>
+          <w:sz w:val="18"/>
+          <w:szCs w:val="18"/>
+        </w:rPr>
+        <w:t xml:space="preserve"> </w:t>
+      </w:r>
+      <w:r>
+        <w:t>estimation of</w:t>
+      </w:r>
+      <w:r>
+        <w:t xml:space="preserve"> </w:t>
+      </w:r>
+      <w:r>
+        <w:t>position by measuring the bearing</w:t>
+      </w:r>
+      <w:r>
+        <w:t xml:space="preserve"> </w:t>
+      </w:r>
+      <w:r>
+        <w:t>angles to an</w:t>
+      </w:r>
+      <w:r>
+        <w:t xml:space="preserve"> </w:t>
+      </w:r>
+      <w:r>
+        <w:t xml:space="preserve">unknown point from </w:t>
+      </w:r>
+      <w:proofErr w:type="gramStart"/>
+      <w:r>
+        <w:t>each</w:t>
+      </w:r>
+      <w:r>
+        <w:t xml:space="preserve">  </w:t>
+      </w:r>
+      <w:r>
+        <w:t>of</w:t>
+      </w:r>
+      <w:proofErr w:type="gramEnd"/>
+      <w:r>
+        <w:t xml:space="preserve"> the landmarks.</w:t>
+      </w:r>
+    </w:p>
+    <w:p/>
+    <w:p/>
+    <w:p/>
+    <w:p>
+      <w:proofErr w:type="spellStart"/>
+      <w:r>
+        <w:lastRenderedPageBreak/>
+        <w:t>Robotis</w:t>
+      </w:r>
+      <w:proofErr w:type="spellEnd"/>
+      <w:r>
+        <w:t xml:space="preserve"> operating </w:t>
+      </w:r>
+      <w:proofErr w:type="spellStart"/>
+      <w:r>
+        <w:t>t</w:t>
+      </w:r>
+      <w:r>
+        <w:t>day</w:t>
+      </w:r>
+      <w:proofErr w:type="spellEnd"/>
+      <w:r>
+        <w:t xml:space="preserve"> in environments without GPS face </w:t>
+      </w:r>
+      <w:proofErr w:type="gramStart"/>
+      <w:r>
+        <w:rPr>
+          <w:i/>
+          <w:iCs/>
+        </w:rPr>
+        <w:t xml:space="preserve">exactly </w:t>
+      </w:r>
+      <w:r>
+        <w:t>the same</w:t>
+      </w:r>
+      <w:proofErr w:type="gramEnd"/>
+    </w:p>
+    <w:p>
+      <w:r>
+        <w:t>problems as the ancient navigators and, perhaps surprisingly</w:t>
+      </w:r>
+    </w:p>
+    <w:p/>
+    <w:p/>
+    <w:p>
+      <w:r>
+        <w:t>map. Additional information from observed features in the world is critical to minimizing</w:t>
+      </w:r>
+    </w:p>
+    <w:p>
+      <w:r>
+        <w:t>a robot’s localization error, but the possibility of data association errors</w:t>
+      </w:r>
+    </w:p>
+    <w:p>
+      <w:r>
+        <w:t>remains.</w:t>
+      </w:r>
+    </w:p>
+    <w:p/>
+    <w:p>
+      <w:r>
+        <w:t>It is useful to describe the robot’s estimated position in terms of a probability</w:t>
+      </w:r>
+    </w:p>
+    <w:p>
+      <w:r>
+        <w:t>density function (PDF) over all possible positions of the robot.</w:t>
+      </w:r>
+    </w:p>
+    <w:p/>
+    <w:p/>
+    <w:p>
+      <w:r>
+        <w:t xml:space="preserve">where the magnitude of the function </w:t>
+      </w:r>
       <w:proofErr w:type="spellStart"/>
       <w:proofErr w:type="gramStart"/>
       <w:r>
+        <w:t>f.x;y</w:t>
+      </w:r>
+      <w:proofErr w:type="spellEnd"/>
+      <w:proofErr w:type="gramEnd"/>
+      <w:r>
+        <w:t>/ at</w:t>
+      </w:r>
+      <w:r>
+        <w:t xml:space="preserve"> </w:t>
+      </w:r>
+      <w:r>
+        <w:t>any point .x; y/ is the relative likelihood of the robot being at that position</w:t>
+      </w:r>
+    </w:p>
+    <w:p/>
+    <w:p>
+      <w:r>
+        <w:t>Determining the PDF based on knowledge of how the robot moves and its observations</w:t>
+      </w:r>
+    </w:p>
+    <w:p>
+      <w:r>
+        <w:t xml:space="preserve">of the world is a problem in </w:t>
+      </w:r>
+      <w:r>
+        <w:rPr>
+          <w:i/>
+          <w:iCs/>
+        </w:rPr>
+        <w:t>estimation</w:t>
+      </w:r>
+      <w:r>
+        <w:t>, which we can define as:</w:t>
+      </w:r>
+    </w:p>
+    <w:p>
+      <w:pPr>
+        <w:rPr>
+          <w:i/>
+          <w:iCs/>
+        </w:rPr>
+      </w:pPr>
+      <w:r>
+        <w:rPr>
+          <w:b/>
+          <w:bCs/>
+        </w:rPr>
+        <w:t xml:space="preserve">» </w:t>
+      </w:r>
+      <w:proofErr w:type="gramStart"/>
+      <w:r>
+        <w:rPr>
+          <w:i/>
+          <w:iCs/>
+        </w:rPr>
+        <w:t>the</w:t>
+      </w:r>
+      <w:proofErr w:type="gramEnd"/>
+      <w:r>
+        <w:rPr>
+          <w:i/>
+          <w:iCs/>
+        </w:rPr>
+        <w:t xml:space="preserve"> process of inferring the value of some quantity of interest, </w:t>
+      </w:r>
+      <w:r>
+        <w:t>x</w:t>
+      </w:r>
+      <w:r>
+        <w:rPr>
+          <w:i/>
+          <w:iCs/>
+        </w:rPr>
+        <w:t>, by processing data</w:t>
+      </w:r>
+    </w:p>
+    <w:p>
+      <w:r>
+        <w:rPr>
+          <w:i/>
+          <w:iCs/>
+        </w:rPr>
+        <w:t xml:space="preserve">that is in some way dependent on </w:t>
+      </w:r>
+      <w:r>
+        <w:t>x.</w:t>
+      </w:r>
+    </w:p>
+    <w:p/>
+    <w:p>
+      <w:r>
+        <w:t>For our robot localization problem, the true and estimated state are vector quantities.</w:t>
+      </w:r>
+    </w:p>
+    <w:p/>
+    <w:p>
+      <w:r>
+        <w:lastRenderedPageBreak/>
+        <w:drawing>
+          <wp:inline distT="0" distB="0" distL="0" distR="0" wp14:anchorId="1C3B79B1" wp14:editId="5692DD6F">
+            <wp:extent cx="5731510" cy="2359660"/>
+            <wp:effectExtent l="0" t="0" r="2540" b="2540"/>
+            <wp:docPr id="948560558" name="Imagen 1"/>
+            <wp:cNvGraphicFramePr>
+              <a:graphicFrameLocks xmlns:a="http://schemas.openxmlformats.org/drawingml/2006/main" noChangeAspect="1"/>
+            </wp:cNvGraphicFramePr>
+            <a:graphic xmlns:a="http://schemas.openxmlformats.org/drawingml/2006/main">
+              <a:graphicData uri="http://schemas.openxmlformats.org/drawingml/2006/picture">
+                <pic:pic xmlns:pic="http://schemas.openxmlformats.org/drawingml/2006/picture">
+                  <pic:nvPicPr>
+                    <pic:cNvPr id="948560558" name=""/>
+                    <pic:cNvPicPr/>
+                  </pic:nvPicPr>
+                  <pic:blipFill>
+                    <a:blip r:embed="rId7"/>
+                    <a:stretch>
+                      <a:fillRect/>
+                    </a:stretch>
+                  </pic:blipFill>
+                  <pic:spPr>
+                    <a:xfrm>
+                      <a:off x="0" y="0"/>
+                      <a:ext cx="5731510" cy="2359660"/>
+                    </a:xfrm>
+                    <a:prstGeom prst="rect">
+                      <a:avLst/>
+                    </a:prstGeom>
+                  </pic:spPr>
+                </pic:pic>
+              </a:graphicData>
+            </a:graphic>
+          </wp:inline>
+        </w:drawing>
+      </w:r>
+    </w:p>
+    <w:p/>
+    <w:p>
+      <w:pPr>
+        <w:numPr>
+          <w:ilvl w:val="0"/>
+          <w:numId w:val="4"/>
+        </w:numPr>
+      </w:pPr>
+      <w:r>
+        <w:t>This figure illustrates the concept of probability density functions (PDFs) to represent the robot's position uncertainty.</w:t>
+      </w:r>
+    </w:p>
+    <w:p>
+      <w:pPr>
+        <w:numPr>
+          <w:ilvl w:val="2"/>
+          <w:numId w:val="4"/>
+        </w:numPr>
+      </w:pPr>
+      <w:r>
+        <w:t>(a) Low position uncertainty (σ = 1): The robot is confident about its position.</w:t>
+      </w:r>
+    </w:p>
+    <w:p>
+      <w:pPr>
+        <w:numPr>
+          <w:ilvl w:val="2"/>
+          <w:numId w:val="4"/>
+        </w:numPr>
+      </w:pPr>
+      <w:r>
+        <w:t>(b) High position uncertainty (σ = 20): The robot has significant uncertainty about its location.</w:t>
+      </w:r>
+    </w:p>
+    <w:p>
+      <w:pPr>
+        <w:numPr>
+          <w:ilvl w:val="2"/>
+          <w:numId w:val="4"/>
+        </w:numPr>
+      </w:pPr>
+      <w:r>
+        <w:t>(c) Multiple hypotheses: The robot believes it could be at one of four possible locations.</w:t>
+      </w:r>
+    </w:p>
+    <w:p>
+      <w:pPr>
+        <w:numPr>
+          <w:ilvl w:val="1"/>
+          <w:numId w:val="4"/>
+        </w:numPr>
+      </w:pPr>
+      <w:r>
+        <w:t>Localization involves estimating the robot's position with associated uncertainty.</w:t>
+      </w:r>
+    </w:p>
+    <w:p>
+      <w:pPr>
+        <w:numPr>
+          <w:ilvl w:val="1"/>
+          <w:numId w:val="4"/>
+        </w:numPr>
+      </w:pPr>
+      <w:r>
+        <w:t>PDFs provide a probabilistic representation of the robot's belief about its position.</w:t>
+      </w:r>
+    </w:p>
+    <w:p>
+      <w:pPr>
+        <w:numPr>
+          <w:ilvl w:val="1"/>
+          <w:numId w:val="4"/>
+        </w:numPr>
+      </w:pPr>
+      <w:r>
+        <w:t>High uncertainty (σ) indicates that the robot is less confident about its location.</w:t>
+      </w:r>
+    </w:p>
+    <w:p/>
+    <w:p>
+      <w:pPr>
+        <w:jc w:val="center"/>
+      </w:pPr>
+      <w:proofErr w:type="spellStart"/>
+      <w:proofErr w:type="gramStart"/>
+      <w:r>
         <w:t>Contens</w:t>
       </w:r>
       <w:proofErr w:type="spellEnd"/>
@@ -37,25 +676,572 @@
       </w:r>
       <w:proofErr w:type="gramEnd"/>
       <w:r>
-        <w:t xml:space="preserve"> cover: </w:t>
-      </w:r>
-    </w:p>
-    <w:p/>
+        <w:t xml:space="preserve"> cover:</w:t>
+      </w:r>
+    </w:p>
+    <w:p>
+      <w:pPr>
+        <w:jc w:val="center"/>
+      </w:pPr>
+    </w:p>
     <w:p>
       <w:r>
         <w:t xml:space="preserve">6.1 Dead Reckoning Using Odometry </w:t>
       </w:r>
     </w:p>
-    <w:p/>
-    <w:p>
-      <w:r>
-        <w:t xml:space="preserve">6.2 Localizing with a Landmark Map </w:t>
-      </w:r>
-    </w:p>
+    <w:p>
+      <w:r>
+        <w:tab/>
+        <w:t xml:space="preserve">Estimating the robot’s position based on its initial pose, velocity and time. </w:t>
+      </w:r>
+    </w:p>
+    <w:p/>
+    <w:p>
+      <w:r>
+        <w:t>Some problems: accumulation of errors over time due to sensor noise and wheel slippage.</w:t>
+      </w:r>
+    </w:p>
+    <w:p>
+      <w:pPr>
+        <w:ind w:left="720"/>
+      </w:pPr>
+    </w:p>
+    <w:p>
+      <w:r>
+        <w:t xml:space="preserve">Inaccurate in environments with significant disturbances. </w:t>
+      </w:r>
+    </w:p>
+    <w:p>
+      <w:r>
+        <w:tab/>
+        <w:t xml:space="preserve">6.1.1 </w:t>
+      </w:r>
+      <w:proofErr w:type="spellStart"/>
+      <w:r>
+        <w:t>Modeling</w:t>
+      </w:r>
+      <w:proofErr w:type="spellEnd"/>
+      <w:r>
+        <w:t xml:space="preserve"> the robot</w:t>
+      </w:r>
+    </w:p>
+    <w:p>
+      <w:r>
+        <w:tab/>
+        <w:t xml:space="preserve">6.1.2 Estimating pose </w:t>
+      </w:r>
+    </w:p>
+    <w:p/>
+    <w:p>
+      <w:pPr>
+        <w:numPr>
+          <w:ilvl w:val="0"/>
+          <w:numId w:val="5"/>
+        </w:numPr>
+      </w:pPr>
+      <w:r>
+        <w:t>Estimates pose from wheel encoders or gyroscopes.</w:t>
+      </w:r>
+    </w:p>
+    <w:p>
+      <w:pPr>
+        <w:numPr>
+          <w:ilvl w:val="0"/>
+          <w:numId w:val="5"/>
+        </w:numPr>
+      </w:pPr>
+      <w:r>
+        <w:t xml:space="preserve">Pose update: </w:t>
+      </w:r>
+      <w:r>
+        <w:rPr>
+          <w:b/>
+          <w:bCs/>
+        </w:rPr>
+        <w:t>q</w:t>
+      </w:r>
+      <w:r>
+        <w:t>(</w:t>
+      </w:r>
+      <w:r>
+        <w:rPr>
+          <w:i/>
+          <w:iCs/>
+        </w:rPr>
+        <w:t>k</w:t>
+      </w:r>
+      <w:r>
+        <w:t>+</w:t>
+      </w:r>
+      <w:proofErr w:type="gramStart"/>
+      <w:r>
+        <w:t>1)=</w:t>
+      </w:r>
+      <w:proofErr w:type="gramEnd"/>
+      <w:r>
+        <w:rPr>
+          <w:i/>
+          <w:iCs/>
+        </w:rPr>
+        <w:t>f</w:t>
+      </w:r>
+      <w:r>
+        <w:t>(</w:t>
+      </w:r>
+      <w:r>
+        <w:rPr>
+          <w:b/>
+          <w:bCs/>
+        </w:rPr>
+        <w:t>q</w:t>
+      </w:r>
+      <w:r>
+        <w:t>(</w:t>
+      </w:r>
+      <w:r>
+        <w:rPr>
+          <w:i/>
+          <w:iCs/>
+        </w:rPr>
+        <w:t>k</w:t>
+      </w:r>
+      <w:proofErr w:type="gramStart"/>
+      <w:r>
+        <w:t>),</w:t>
+      </w:r>
+      <w:r>
+        <w:rPr>
+          <w:b/>
+          <w:bCs/>
+          <w:i/>
+          <w:iCs/>
+        </w:rPr>
+        <w:t>δ</w:t>
+      </w:r>
+      <w:proofErr w:type="gramEnd"/>
+      <w:r>
+        <w:t>(</w:t>
+      </w:r>
+      <w:r>
+        <w:rPr>
+          <w:i/>
+          <w:iCs/>
+        </w:rPr>
+        <w:t>k</w:t>
+      </w:r>
+      <w:proofErr w:type="gramStart"/>
+      <w:r>
+        <w:t>),</w:t>
+      </w:r>
+      <w:r>
+        <w:rPr>
+          <w:b/>
+          <w:bCs/>
+        </w:rPr>
+        <w:t>v</w:t>
+      </w:r>
+      <w:proofErr w:type="gramEnd"/>
+      <w:r>
+        <w:t>(</w:t>
+      </w:r>
+      <w:r>
+        <w:rPr>
+          <w:i/>
+          <w:iCs/>
+        </w:rPr>
+        <w:t>k</w:t>
+      </w:r>
+      <w:r>
+        <w:t>)</w:t>
+      </w:r>
+      <w:proofErr w:type="gramStart"/>
+      <w:r>
+        <w:t>) .</w:t>
+      </w:r>
+      <w:proofErr w:type="gramEnd"/>
+    </w:p>
+    <w:p>
+      <w:pPr>
+        <w:numPr>
+          <w:ilvl w:val="0"/>
+          <w:numId w:val="5"/>
+        </w:numPr>
+      </w:pPr>
+      <w:r>
+        <w:t xml:space="preserve">Odometry noise: </w:t>
+      </w:r>
+      <w:r>
+        <w:rPr>
+          <w:b/>
+          <w:bCs/>
+        </w:rPr>
+        <w:t>v</w:t>
+      </w:r>
+      <w:r>
+        <w:t>(</w:t>
+      </w:r>
+      <w:r>
+        <w:rPr>
+          <w:i/>
+          <w:iCs/>
+        </w:rPr>
+        <w:t>k</w:t>
+      </w:r>
+      <w:r>
+        <w:t>)</w:t>
+      </w:r>
+      <w:r>
+        <w:rPr>
+          <w:rFonts w:ascii="Cambria Math" w:hAnsi="Cambria Math" w:cs="Cambria Math"/>
+        </w:rPr>
+        <w:t>∼</w:t>
+      </w:r>
+      <w:r>
+        <w:rPr>
+          <w:i/>
+          <w:iCs/>
+        </w:rPr>
+        <w:t>N</w:t>
+      </w:r>
+      <w:r>
+        <w:t>(</w:t>
+      </w:r>
+      <w:proofErr w:type="gramStart"/>
+      <w:r>
+        <w:t>0,</w:t>
+      </w:r>
+      <w:r>
+        <w:rPr>
+          <w:b/>
+          <w:bCs/>
+        </w:rPr>
+        <w:t>V</w:t>
+      </w:r>
+      <w:r>
+        <w:t>) .</w:t>
+      </w:r>
+      <w:proofErr w:type="gramEnd"/>
+    </w:p>
+    <w:p>
+      <w:pPr>
+        <w:numPr>
+          <w:ilvl w:val="0"/>
+          <w:numId w:val="5"/>
+        </w:numPr>
+      </w:pPr>
+      <w:r>
+        <w:t>EKF for recursive estimation.</w:t>
+      </w:r>
+    </w:p>
+    <w:p>
+      <w:pPr>
+        <w:numPr>
+          <w:ilvl w:val="0"/>
+          <w:numId w:val="5"/>
+        </w:numPr>
+      </w:pPr>
+      <w:r>
+        <w:t>Uncertainty grows over time.</w:t>
+      </w:r>
+    </w:p>
+    <w:p>
+      <w:pPr>
+        <w:numPr>
+          <w:ilvl w:val="0"/>
+          <w:numId w:val="5"/>
+        </w:numPr>
+      </w:pPr>
+      <w:r>
+        <w:t xml:space="preserve">confidence ellipses </w:t>
+      </w:r>
+    </w:p>
+    <w:p>
+      <w:pPr>
+        <w:ind w:left="720"/>
+      </w:pPr>
+    </w:p>
+    <w:p/>
+    <w:p>
+      <w:r>
+        <w:t>6.2 Localizing with a Landmark Map</w:t>
+      </w:r>
+    </w:p>
+    <w:p>
+      <w:r>
+        <w:tab/>
+        <w:t xml:space="preserve">Using known landmarks to refine robot’s position estimate. </w:t>
+      </w:r>
+    </w:p>
+    <w:p>
+      <w:r>
+        <w:tab/>
+      </w:r>
+      <w:proofErr w:type="gramStart"/>
+      <w:r>
+        <w:t>How ?</w:t>
+      </w:r>
+      <w:proofErr w:type="gramEnd"/>
+      <w:r>
+        <w:t xml:space="preserve"> </w:t>
+      </w:r>
+    </w:p>
+    <w:p>
+      <w:pPr>
+        <w:pStyle w:val="Prrafodelista"/>
+        <w:numPr>
+          <w:ilvl w:val="2"/>
+          <w:numId w:val="4"/>
+        </w:numPr>
+      </w:pPr>
+      <w:r>
+        <w:t xml:space="preserve">Measure bearing angles to </w:t>
+      </w:r>
+      <w:proofErr w:type="gramStart"/>
+      <w:r>
+        <w:t>land marks</w:t>
+      </w:r>
+      <w:proofErr w:type="gramEnd"/>
+      <w:r>
+        <w:t xml:space="preserve"> or</w:t>
+      </w:r>
+    </w:p>
+    <w:p>
+      <w:pPr>
+        <w:pStyle w:val="Prrafodelista"/>
+        <w:numPr>
+          <w:ilvl w:val="2"/>
+          <w:numId w:val="4"/>
+        </w:numPr>
+      </w:pPr>
+      <w:r>
+        <w:t xml:space="preserve">Use triangulation to compute </w:t>
+      </w:r>
+      <w:proofErr w:type="gramStart"/>
+      <w:r>
+        <w:t>robots</w:t>
+      </w:r>
+      <w:proofErr w:type="gramEnd"/>
+      <w:r>
+        <w:t xml:space="preserve"> position </w:t>
+      </w:r>
+    </w:p>
+    <w:p>
+      <w:pPr>
+        <w:ind w:left="720"/>
+      </w:pPr>
+      <w:r>
+        <w:t xml:space="preserve">Some </w:t>
+      </w:r>
+      <w:proofErr w:type="gramStart"/>
+      <w:r>
+        <w:t>problems :</w:t>
+      </w:r>
+      <w:proofErr w:type="gramEnd"/>
+      <w:r>
+        <w:t xml:space="preserve"> </w:t>
+      </w:r>
+    </w:p>
+    <w:p>
+      <w:pPr>
+        <w:pStyle w:val="Prrafodelista"/>
+        <w:numPr>
+          <w:ilvl w:val="2"/>
+          <w:numId w:val="4"/>
+        </w:numPr>
+      </w:pPr>
+      <w:r>
+        <w:t xml:space="preserve">Data association </w:t>
+      </w:r>
+    </w:p>
+    <w:p>
+      <w:pPr>
+        <w:pStyle w:val="Prrafodelista"/>
+        <w:numPr>
+          <w:ilvl w:val="2"/>
+          <w:numId w:val="4"/>
+        </w:numPr>
+      </w:pPr>
+      <w:r>
+        <w:t xml:space="preserve">Sensor noise and changes to environment that affects landmark </w:t>
+      </w:r>
+      <w:proofErr w:type="spellStart"/>
+      <w:r>
+        <w:t>visibily</w:t>
+      </w:r>
+      <w:proofErr w:type="spellEnd"/>
+    </w:p>
+    <w:p/>
+    <w:p>
+      <w:pPr>
+        <w:ind w:left="720"/>
+      </w:pPr>
+      <w:r>
+        <w:t>Sensor measures range and bearing</w:t>
+      </w:r>
+    </w:p>
+    <w:p>
+      <w:pPr>
+        <w:ind w:left="720"/>
+      </w:pPr>
+      <w:r>
+        <w:t xml:space="preserve">observation model </w:t>
+      </w:r>
+    </w:p>
+    <w:p>
+      <w:pPr>
+        <w:ind w:left="720"/>
+      </w:pPr>
+      <w:r>
+        <w:t xml:space="preserve">Kalman filter updates pose using landmarks observations </w:t>
+      </w:r>
+    </w:p>
+    <w:p>
+      <w:pPr>
+        <w:ind w:left="720"/>
+      </w:pPr>
+      <w:r>
+        <w:t>reduces uncertainty significantly</w:t>
+      </w:r>
+    </w:p>
+    <w:p>
+      <w:pPr>
+        <w:ind w:left="720"/>
+      </w:pPr>
+      <w:r>
+        <w:t xml:space="preserve">data association critical for correct mapping </w:t>
+      </w:r>
+    </w:p>
+    <w:p/>
     <w:p/>
     <w:p>
       <w:r>
         <w:t xml:space="preserve">6.3 Creating a Landmark Map </w:t>
+      </w:r>
+    </w:p>
+    <w:p>
+      <w:r>
+        <w:tab/>
+        <w:t>Construct a map of the environment by detecting and localizing landmarks</w:t>
+      </w:r>
+    </w:p>
+    <w:p/>
+    <w:p>
+      <w:r>
+        <w:tab/>
+      </w:r>
+      <w:r>
+        <w:tab/>
+        <w:t xml:space="preserve">We </w:t>
+      </w:r>
+      <w:proofErr w:type="gramStart"/>
+      <w:r>
+        <w:t>can :</w:t>
+      </w:r>
+      <w:proofErr w:type="gramEnd"/>
+      <w:r>
+        <w:t xml:space="preserve"> </w:t>
+      </w:r>
+    </w:p>
+    <w:p>
+      <w:r>
+        <w:tab/>
+        <w:t>Detect salient features in the environment.</w:t>
+      </w:r>
+    </w:p>
+    <w:p>
+      <w:r>
+        <w:tab/>
+        <w:t xml:space="preserve">Associate detected features with </w:t>
+      </w:r>
+      <w:proofErr w:type="gramStart"/>
+      <w:r>
+        <w:t>land marks</w:t>
+      </w:r>
+      <w:proofErr w:type="gramEnd"/>
+      <w:r>
+        <w:t xml:space="preserve"> in the map</w:t>
+      </w:r>
+      <w:r>
+        <w:tab/>
+      </w:r>
+    </w:p>
+    <w:p>
+      <w:r>
+        <w:tab/>
+        <w:t xml:space="preserve">then we update the map as the robot explores </w:t>
+      </w:r>
+    </w:p>
+    <w:p>
+      <w:r>
+        <w:tab/>
+      </w:r>
+      <w:r>
+        <w:tab/>
+        <w:t xml:space="preserve">some problems: </w:t>
+      </w:r>
+    </w:p>
+    <w:p>
+      <w:r>
+        <w:tab/>
+        <w:t xml:space="preserve"> feature ambiguity</w:t>
+      </w:r>
+    </w:p>
+    <w:p>
+      <w:r>
+        <w:tab/>
+        <w:t>handling occlusions</w:t>
+      </w:r>
+    </w:p>
+    <w:p>
+      <w:r>
+        <w:tab/>
+        <w:t>lighting changes</w:t>
+      </w:r>
+    </w:p>
+    <w:p>
+      <w:r>
+        <w:tab/>
+        <w:t>ensure consistency and completeness of the map</w:t>
+      </w:r>
+    </w:p>
+    <w:p>
+      <w:r>
+        <w:tab/>
+      </w:r>
+      <w:r>
+        <w:tab/>
+        <w:t xml:space="preserve">this is useful to build reference maps for future problems. </w:t>
+      </w:r>
+    </w:p>
+    <w:p/>
+    <w:p>
+      <w:r>
+        <w:tab/>
+        <w:t xml:space="preserve">State vector includes landmark coordinates. </w:t>
+      </w:r>
+    </w:p>
+    <w:p>
+      <w:r>
+        <w:tab/>
+        <w:t xml:space="preserve">Covariance matrix tracks landmark uncertainties </w:t>
+      </w:r>
+    </w:p>
+    <w:p>
+      <w:r>
+        <w:tab/>
+        <w:t>Function g(.) maps sensor data to world coordinates</w:t>
+      </w:r>
+    </w:p>
+    <w:p>
+      <w:r>
+        <w:tab/>
+        <w:t>WKF extends state vector for new landmarks</w:t>
+      </w:r>
+    </w:p>
+    <w:p>
+      <w:r>
+        <w:tab/>
+        <w:t xml:space="preserve">Results show evolving confidence ellipses. </w:t>
       </w:r>
     </w:p>
     <w:p/>
@@ -124,6 +1310,771 @@
     </w:sectPr>
   </w:body>
 </w:document>
+</file>
+
+<file path=word/numbering.xml><?xml version="1.0" encoding="utf-8"?>
+<w:numbering xmlns:wpc="http://schemas.microsoft.com/office/word/2010/wordprocessingCanvas" xmlns:cx="http://schemas.microsoft.com/office/drawing/2014/chartex" xmlns:cx1="http://schemas.microsoft.com/office/drawing/2015/9/8/chartex" xmlns:cx2="http://schemas.microsoft.com/office/drawing/2015/10/21/chartex" xmlns:cx3="http://schemas.microsoft.com/office/drawing/2016/5/9/chartex" xmlns:cx4="http://schemas.microsoft.com/office/drawing/2016/5/10/chartex" xmlns:cx5="http://schemas.microsoft.com/office/drawing/2016/5/11/chartex" xmlns:cx6="http://schemas.microsoft.com/office/drawing/2016/5/12/chartex" xmlns:cx7="http://schemas.microsoft.com/office/drawing/2016/5/13/chartex" xmlns:cx8="http://schemas.microsoft.com/office/drawing/2016/5/14/chartex" xmlns:mc="http://schemas.openxmlformats.org/markup-compatibility/2006" xmlns:aink="http://schemas.microsoft.com/office/drawing/2016/ink" xmlns:am3d="http://schemas.microsoft.com/office/drawing/2017/model3d" xmlns:o="urn:schemas-microsoft-com:office:office" xmlns:oel="http://schemas.microsoft.com/office/2019/extlst" xmlns:r="http://schemas.openxmlformats.org/officeDocument/2006/relationships" xmlns:m="http://schemas.openxmlformats.org/officeDocument/2006/math" xmlns:v="urn:schemas-microsoft-com:vml" xmlns:wp14="http://schemas.microsoft.com/office/word/2010/wordprocessingDrawing" xmlns:wp="http://schemas.openxmlformats.org/drawingml/2006/wordprocessingDrawing" xmlns:w10="urn:schemas-microsoft-com:office:word" xmlns:w="http://schemas.openxmlformats.org/wordprocessingml/2006/main" xmlns:w14="http://schemas.microsoft.com/office/word/2010/wordml" xmlns:w15="http://schemas.microsoft.com/office/word/2012/wordml" xmlns:w16cex="http://schemas.microsoft.com/office/word/2018/wordml/cex" xmlns:w16cid="http://schemas.microsoft.com/office/word/2016/wordml/cid" xmlns:w16="http://schemas.microsoft.com/office/word/2018/wordml" xmlns:w16du="http://schemas.microsoft.com/office/word/2023/wordml/word16du" xmlns:w16sdtdh="http://schemas.microsoft.com/office/word/2020/wordml/sdtdatahash" xmlns:w16sdtfl="http://schemas.microsoft.com/office/word/2024/wordml/sdtformatlock" xmlns:w16se="http://schemas.microsoft.com/office/word/2015/wordml/symex" xmlns:wpg="http://schemas.microsoft.com/office/word/2010/wordprocessingGroup" xmlns:wpi="http://schemas.microsoft.com/office/word/2010/wordprocessingInk" xmlns:wne="http://schemas.microsoft.com/office/word/2006/wordml" xmlns:wps="http://schemas.microsoft.com/office/word/2010/wordprocessingShape" mc:Ignorable="w14 w15 w16se w16cid w16 w16cex w16sdtdh w16sdtfl w16du wp14">
+  <w:abstractNum w:abstractNumId="0" w15:restartNumberingAfterBreak="0">
+    <w:nsid w:val="5AF5431E"/>
+    <w:multiLevelType w:val="multilevel"/>
+    <w:tmpl w:val="3F8E89EE"/>
+    <w:lvl w:ilvl="0">
+      <w:start w:val="1"/>
+      <w:numFmt w:val="bullet"/>
+      <w:lvlText w:val=""/>
+      <w:lvlJc w:val="left"/>
+      <w:pPr>
+        <w:tabs>
+          <w:tab w:val="num" w:pos="720"/>
+        </w:tabs>
+        <w:ind w:left="720" w:hanging="360"/>
+      </w:pPr>
+      <w:rPr>
+        <w:rFonts w:ascii="Symbol" w:hAnsi="Symbol" w:hint="default"/>
+        <w:sz w:val="20"/>
+      </w:rPr>
+    </w:lvl>
+    <w:lvl w:ilvl="1" w:tentative="1">
+      <w:start w:val="1"/>
+      <w:numFmt w:val="bullet"/>
+      <w:lvlText w:val=""/>
+      <w:lvlJc w:val="left"/>
+      <w:pPr>
+        <w:tabs>
+          <w:tab w:val="num" w:pos="1440"/>
+        </w:tabs>
+        <w:ind w:left="1440" w:hanging="360"/>
+      </w:pPr>
+      <w:rPr>
+        <w:rFonts w:ascii="Symbol" w:hAnsi="Symbol" w:hint="default"/>
+        <w:sz w:val="20"/>
+      </w:rPr>
+    </w:lvl>
+    <w:lvl w:ilvl="2" w:tentative="1">
+      <w:start w:val="1"/>
+      <w:numFmt w:val="bullet"/>
+      <w:lvlText w:val=""/>
+      <w:lvlJc w:val="left"/>
+      <w:pPr>
+        <w:tabs>
+          <w:tab w:val="num" w:pos="2160"/>
+        </w:tabs>
+        <w:ind w:left="2160" w:hanging="360"/>
+      </w:pPr>
+      <w:rPr>
+        <w:rFonts w:ascii="Symbol" w:hAnsi="Symbol" w:hint="default"/>
+        <w:sz w:val="20"/>
+      </w:rPr>
+    </w:lvl>
+    <w:lvl w:ilvl="3" w:tentative="1">
+      <w:start w:val="1"/>
+      <w:numFmt w:val="bullet"/>
+      <w:lvlText w:val=""/>
+      <w:lvlJc w:val="left"/>
+      <w:pPr>
+        <w:tabs>
+          <w:tab w:val="num" w:pos="2880"/>
+        </w:tabs>
+        <w:ind w:left="2880" w:hanging="360"/>
+      </w:pPr>
+      <w:rPr>
+        <w:rFonts w:ascii="Symbol" w:hAnsi="Symbol" w:hint="default"/>
+        <w:sz w:val="20"/>
+      </w:rPr>
+    </w:lvl>
+    <w:lvl w:ilvl="4" w:tentative="1">
+      <w:start w:val="1"/>
+      <w:numFmt w:val="bullet"/>
+      <w:lvlText w:val=""/>
+      <w:lvlJc w:val="left"/>
+      <w:pPr>
+        <w:tabs>
+          <w:tab w:val="num" w:pos="3600"/>
+        </w:tabs>
+        <w:ind w:left="3600" w:hanging="360"/>
+      </w:pPr>
+      <w:rPr>
+        <w:rFonts w:ascii="Symbol" w:hAnsi="Symbol" w:hint="default"/>
+        <w:sz w:val="20"/>
+      </w:rPr>
+    </w:lvl>
+    <w:lvl w:ilvl="5" w:tentative="1">
+      <w:start w:val="1"/>
+      <w:numFmt w:val="bullet"/>
+      <w:lvlText w:val=""/>
+      <w:lvlJc w:val="left"/>
+      <w:pPr>
+        <w:tabs>
+          <w:tab w:val="num" w:pos="4320"/>
+        </w:tabs>
+        <w:ind w:left="4320" w:hanging="360"/>
+      </w:pPr>
+      <w:rPr>
+        <w:rFonts w:ascii="Symbol" w:hAnsi="Symbol" w:hint="default"/>
+        <w:sz w:val="20"/>
+      </w:rPr>
+    </w:lvl>
+    <w:lvl w:ilvl="6" w:tentative="1">
+      <w:start w:val="1"/>
+      <w:numFmt w:val="bullet"/>
+      <w:lvlText w:val=""/>
+      <w:lvlJc w:val="left"/>
+      <w:pPr>
+        <w:tabs>
+          <w:tab w:val="num" w:pos="5040"/>
+        </w:tabs>
+        <w:ind w:left="5040" w:hanging="360"/>
+      </w:pPr>
+      <w:rPr>
+        <w:rFonts w:ascii="Symbol" w:hAnsi="Symbol" w:hint="default"/>
+        <w:sz w:val="20"/>
+      </w:rPr>
+    </w:lvl>
+    <w:lvl w:ilvl="7" w:tentative="1">
+      <w:start w:val="1"/>
+      <w:numFmt w:val="bullet"/>
+      <w:lvlText w:val=""/>
+      <w:lvlJc w:val="left"/>
+      <w:pPr>
+        <w:tabs>
+          <w:tab w:val="num" w:pos="5760"/>
+        </w:tabs>
+        <w:ind w:left="5760" w:hanging="360"/>
+      </w:pPr>
+      <w:rPr>
+        <w:rFonts w:ascii="Symbol" w:hAnsi="Symbol" w:hint="default"/>
+        <w:sz w:val="20"/>
+      </w:rPr>
+    </w:lvl>
+    <w:lvl w:ilvl="8" w:tentative="1">
+      <w:start w:val="1"/>
+      <w:numFmt w:val="bullet"/>
+      <w:lvlText w:val=""/>
+      <w:lvlJc w:val="left"/>
+      <w:pPr>
+        <w:tabs>
+          <w:tab w:val="num" w:pos="6480"/>
+        </w:tabs>
+        <w:ind w:left="6480" w:hanging="360"/>
+      </w:pPr>
+      <w:rPr>
+        <w:rFonts w:ascii="Symbol" w:hAnsi="Symbol" w:hint="default"/>
+        <w:sz w:val="20"/>
+      </w:rPr>
+    </w:lvl>
+  </w:abstractNum>
+  <w:abstractNum w:abstractNumId="1" w15:restartNumberingAfterBreak="0">
+    <w:nsid w:val="60AE3D81"/>
+    <w:multiLevelType w:val="multilevel"/>
+    <w:tmpl w:val="649E99EA"/>
+    <w:lvl w:ilvl="0">
+      <w:start w:val="1"/>
+      <w:numFmt w:val="bullet"/>
+      <w:lvlText w:val=""/>
+      <w:lvlJc w:val="left"/>
+      <w:pPr>
+        <w:tabs>
+          <w:tab w:val="num" w:pos="720"/>
+        </w:tabs>
+        <w:ind w:left="720" w:hanging="360"/>
+      </w:pPr>
+      <w:rPr>
+        <w:rFonts w:ascii="Symbol" w:hAnsi="Symbol" w:hint="default"/>
+        <w:sz w:val="20"/>
+      </w:rPr>
+    </w:lvl>
+    <w:lvl w:ilvl="1" w:tentative="1">
+      <w:start w:val="1"/>
+      <w:numFmt w:val="bullet"/>
+      <w:lvlText w:val=""/>
+      <w:lvlJc w:val="left"/>
+      <w:pPr>
+        <w:tabs>
+          <w:tab w:val="num" w:pos="1440"/>
+        </w:tabs>
+        <w:ind w:left="1440" w:hanging="360"/>
+      </w:pPr>
+      <w:rPr>
+        <w:rFonts w:ascii="Symbol" w:hAnsi="Symbol" w:hint="default"/>
+        <w:sz w:val="20"/>
+      </w:rPr>
+    </w:lvl>
+    <w:lvl w:ilvl="2" w:tentative="1">
+      <w:start w:val="1"/>
+      <w:numFmt w:val="bullet"/>
+      <w:lvlText w:val=""/>
+      <w:lvlJc w:val="left"/>
+      <w:pPr>
+        <w:tabs>
+          <w:tab w:val="num" w:pos="2160"/>
+        </w:tabs>
+        <w:ind w:left="2160" w:hanging="360"/>
+      </w:pPr>
+      <w:rPr>
+        <w:rFonts w:ascii="Symbol" w:hAnsi="Symbol" w:hint="default"/>
+        <w:sz w:val="20"/>
+      </w:rPr>
+    </w:lvl>
+    <w:lvl w:ilvl="3" w:tentative="1">
+      <w:start w:val="1"/>
+      <w:numFmt w:val="bullet"/>
+      <w:lvlText w:val=""/>
+      <w:lvlJc w:val="left"/>
+      <w:pPr>
+        <w:tabs>
+          <w:tab w:val="num" w:pos="2880"/>
+        </w:tabs>
+        <w:ind w:left="2880" w:hanging="360"/>
+      </w:pPr>
+      <w:rPr>
+        <w:rFonts w:ascii="Symbol" w:hAnsi="Symbol" w:hint="default"/>
+        <w:sz w:val="20"/>
+      </w:rPr>
+    </w:lvl>
+    <w:lvl w:ilvl="4" w:tentative="1">
+      <w:start w:val="1"/>
+      <w:numFmt w:val="bullet"/>
+      <w:lvlText w:val=""/>
+      <w:lvlJc w:val="left"/>
+      <w:pPr>
+        <w:tabs>
+          <w:tab w:val="num" w:pos="3600"/>
+        </w:tabs>
+        <w:ind w:left="3600" w:hanging="360"/>
+      </w:pPr>
+      <w:rPr>
+        <w:rFonts w:ascii="Symbol" w:hAnsi="Symbol" w:hint="default"/>
+        <w:sz w:val="20"/>
+      </w:rPr>
+    </w:lvl>
+    <w:lvl w:ilvl="5" w:tentative="1">
+      <w:start w:val="1"/>
+      <w:numFmt w:val="bullet"/>
+      <w:lvlText w:val=""/>
+      <w:lvlJc w:val="left"/>
+      <w:pPr>
+        <w:tabs>
+          <w:tab w:val="num" w:pos="4320"/>
+        </w:tabs>
+        <w:ind w:left="4320" w:hanging="360"/>
+      </w:pPr>
+      <w:rPr>
+        <w:rFonts w:ascii="Symbol" w:hAnsi="Symbol" w:hint="default"/>
+        <w:sz w:val="20"/>
+      </w:rPr>
+    </w:lvl>
+    <w:lvl w:ilvl="6" w:tentative="1">
+      <w:start w:val="1"/>
+      <w:numFmt w:val="bullet"/>
+      <w:lvlText w:val=""/>
+      <w:lvlJc w:val="left"/>
+      <w:pPr>
+        <w:tabs>
+          <w:tab w:val="num" w:pos="5040"/>
+        </w:tabs>
+        <w:ind w:left="5040" w:hanging="360"/>
+      </w:pPr>
+      <w:rPr>
+        <w:rFonts w:ascii="Symbol" w:hAnsi="Symbol" w:hint="default"/>
+        <w:sz w:val="20"/>
+      </w:rPr>
+    </w:lvl>
+    <w:lvl w:ilvl="7" w:tentative="1">
+      <w:start w:val="1"/>
+      <w:numFmt w:val="bullet"/>
+      <w:lvlText w:val=""/>
+      <w:lvlJc w:val="left"/>
+      <w:pPr>
+        <w:tabs>
+          <w:tab w:val="num" w:pos="5760"/>
+        </w:tabs>
+        <w:ind w:left="5760" w:hanging="360"/>
+      </w:pPr>
+      <w:rPr>
+        <w:rFonts w:ascii="Symbol" w:hAnsi="Symbol" w:hint="default"/>
+        <w:sz w:val="20"/>
+      </w:rPr>
+    </w:lvl>
+    <w:lvl w:ilvl="8" w:tentative="1">
+      <w:start w:val="1"/>
+      <w:numFmt w:val="bullet"/>
+      <w:lvlText w:val=""/>
+      <w:lvlJc w:val="left"/>
+      <w:pPr>
+        <w:tabs>
+          <w:tab w:val="num" w:pos="6480"/>
+        </w:tabs>
+        <w:ind w:left="6480" w:hanging="360"/>
+      </w:pPr>
+      <w:rPr>
+        <w:rFonts w:ascii="Symbol" w:hAnsi="Symbol" w:hint="default"/>
+        <w:sz w:val="20"/>
+      </w:rPr>
+    </w:lvl>
+  </w:abstractNum>
+  <w:abstractNum w:abstractNumId="2" w15:restartNumberingAfterBreak="0">
+    <w:nsid w:val="6114793E"/>
+    <w:multiLevelType w:val="multilevel"/>
+    <w:tmpl w:val="4766749E"/>
+    <w:lvl w:ilvl="0">
+      <w:start w:val="1"/>
+      <w:numFmt w:val="bullet"/>
+      <w:lvlText w:val=""/>
+      <w:lvlJc w:val="left"/>
+      <w:pPr>
+        <w:tabs>
+          <w:tab w:val="num" w:pos="720"/>
+        </w:tabs>
+        <w:ind w:left="720" w:hanging="360"/>
+      </w:pPr>
+      <w:rPr>
+        <w:rFonts w:ascii="Symbol" w:hAnsi="Symbol" w:hint="default"/>
+        <w:sz w:val="20"/>
+      </w:rPr>
+    </w:lvl>
+    <w:lvl w:ilvl="1">
+      <w:start w:val="1"/>
+      <w:numFmt w:val="bullet"/>
+      <w:lvlText w:val=""/>
+      <w:lvlJc w:val="left"/>
+      <w:pPr>
+        <w:tabs>
+          <w:tab w:val="num" w:pos="1440"/>
+        </w:tabs>
+        <w:ind w:left="1440" w:hanging="360"/>
+      </w:pPr>
+      <w:rPr>
+        <w:rFonts w:ascii="Symbol" w:hAnsi="Symbol" w:hint="default"/>
+        <w:sz w:val="20"/>
+      </w:rPr>
+    </w:lvl>
+    <w:lvl w:ilvl="2">
+      <w:start w:val="1"/>
+      <w:numFmt w:val="bullet"/>
+      <w:lvlText w:val=""/>
+      <w:lvlJc w:val="left"/>
+      <w:pPr>
+        <w:tabs>
+          <w:tab w:val="num" w:pos="2160"/>
+        </w:tabs>
+        <w:ind w:left="2160" w:hanging="360"/>
+      </w:pPr>
+      <w:rPr>
+        <w:rFonts w:ascii="Symbol" w:hAnsi="Symbol" w:hint="default"/>
+        <w:sz w:val="20"/>
+      </w:rPr>
+    </w:lvl>
+    <w:lvl w:ilvl="3">
+      <w:start w:val="1"/>
+      <w:numFmt w:val="bullet"/>
+      <w:lvlText w:val=""/>
+      <w:lvlJc w:val="left"/>
+      <w:pPr>
+        <w:tabs>
+          <w:tab w:val="num" w:pos="2880"/>
+        </w:tabs>
+        <w:ind w:left="2880" w:hanging="360"/>
+      </w:pPr>
+      <w:rPr>
+        <w:rFonts w:ascii="Symbol" w:hAnsi="Symbol" w:hint="default"/>
+        <w:sz w:val="20"/>
+      </w:rPr>
+    </w:lvl>
+    <w:lvl w:ilvl="4" w:tentative="1">
+      <w:start w:val="1"/>
+      <w:numFmt w:val="bullet"/>
+      <w:lvlText w:val=""/>
+      <w:lvlJc w:val="left"/>
+      <w:pPr>
+        <w:tabs>
+          <w:tab w:val="num" w:pos="3600"/>
+        </w:tabs>
+        <w:ind w:left="3600" w:hanging="360"/>
+      </w:pPr>
+      <w:rPr>
+        <w:rFonts w:ascii="Symbol" w:hAnsi="Symbol" w:hint="default"/>
+        <w:sz w:val="20"/>
+      </w:rPr>
+    </w:lvl>
+    <w:lvl w:ilvl="5" w:tentative="1">
+      <w:start w:val="1"/>
+      <w:numFmt w:val="bullet"/>
+      <w:lvlText w:val=""/>
+      <w:lvlJc w:val="left"/>
+      <w:pPr>
+        <w:tabs>
+          <w:tab w:val="num" w:pos="4320"/>
+        </w:tabs>
+        <w:ind w:left="4320" w:hanging="360"/>
+      </w:pPr>
+      <w:rPr>
+        <w:rFonts w:ascii="Symbol" w:hAnsi="Symbol" w:hint="default"/>
+        <w:sz w:val="20"/>
+      </w:rPr>
+    </w:lvl>
+    <w:lvl w:ilvl="6" w:tentative="1">
+      <w:start w:val="1"/>
+      <w:numFmt w:val="bullet"/>
+      <w:lvlText w:val=""/>
+      <w:lvlJc w:val="left"/>
+      <w:pPr>
+        <w:tabs>
+          <w:tab w:val="num" w:pos="5040"/>
+        </w:tabs>
+        <w:ind w:left="5040" w:hanging="360"/>
+      </w:pPr>
+      <w:rPr>
+        <w:rFonts w:ascii="Symbol" w:hAnsi="Symbol" w:hint="default"/>
+        <w:sz w:val="20"/>
+      </w:rPr>
+    </w:lvl>
+    <w:lvl w:ilvl="7" w:tentative="1">
+      <w:start w:val="1"/>
+      <w:numFmt w:val="bullet"/>
+      <w:lvlText w:val=""/>
+      <w:lvlJc w:val="left"/>
+      <w:pPr>
+        <w:tabs>
+          <w:tab w:val="num" w:pos="5760"/>
+        </w:tabs>
+        <w:ind w:left="5760" w:hanging="360"/>
+      </w:pPr>
+      <w:rPr>
+        <w:rFonts w:ascii="Symbol" w:hAnsi="Symbol" w:hint="default"/>
+        <w:sz w:val="20"/>
+      </w:rPr>
+    </w:lvl>
+    <w:lvl w:ilvl="8" w:tentative="1">
+      <w:start w:val="1"/>
+      <w:numFmt w:val="bullet"/>
+      <w:lvlText w:val=""/>
+      <w:lvlJc w:val="left"/>
+      <w:pPr>
+        <w:tabs>
+          <w:tab w:val="num" w:pos="6480"/>
+        </w:tabs>
+        <w:ind w:left="6480" w:hanging="360"/>
+      </w:pPr>
+      <w:rPr>
+        <w:rFonts w:ascii="Symbol" w:hAnsi="Symbol" w:hint="default"/>
+        <w:sz w:val="20"/>
+      </w:rPr>
+    </w:lvl>
+  </w:abstractNum>
+  <w:abstractNum w:abstractNumId="3" w15:restartNumberingAfterBreak="0">
+    <w:nsid w:val="650A0BB8"/>
+    <w:multiLevelType w:val="multilevel"/>
+    <w:tmpl w:val="94AAE0F4"/>
+    <w:lvl w:ilvl="0">
+      <w:start w:val="1"/>
+      <w:numFmt w:val="bullet"/>
+      <w:lvlText w:val=""/>
+      <w:lvlJc w:val="left"/>
+      <w:pPr>
+        <w:tabs>
+          <w:tab w:val="num" w:pos="720"/>
+        </w:tabs>
+        <w:ind w:left="720" w:hanging="360"/>
+      </w:pPr>
+      <w:rPr>
+        <w:rFonts w:ascii="Symbol" w:hAnsi="Symbol" w:hint="default"/>
+        <w:sz w:val="20"/>
+      </w:rPr>
+    </w:lvl>
+    <w:lvl w:ilvl="1" w:tentative="1">
+      <w:start w:val="1"/>
+      <w:numFmt w:val="bullet"/>
+      <w:lvlText w:val=""/>
+      <w:lvlJc w:val="left"/>
+      <w:pPr>
+        <w:tabs>
+          <w:tab w:val="num" w:pos="1440"/>
+        </w:tabs>
+        <w:ind w:left="1440" w:hanging="360"/>
+      </w:pPr>
+      <w:rPr>
+        <w:rFonts w:ascii="Symbol" w:hAnsi="Symbol" w:hint="default"/>
+        <w:sz w:val="20"/>
+      </w:rPr>
+    </w:lvl>
+    <w:lvl w:ilvl="2" w:tentative="1">
+      <w:start w:val="1"/>
+      <w:numFmt w:val="bullet"/>
+      <w:lvlText w:val=""/>
+      <w:lvlJc w:val="left"/>
+      <w:pPr>
+        <w:tabs>
+          <w:tab w:val="num" w:pos="2160"/>
+        </w:tabs>
+        <w:ind w:left="2160" w:hanging="360"/>
+      </w:pPr>
+      <w:rPr>
+        <w:rFonts w:ascii="Symbol" w:hAnsi="Symbol" w:hint="default"/>
+        <w:sz w:val="20"/>
+      </w:rPr>
+    </w:lvl>
+    <w:lvl w:ilvl="3" w:tentative="1">
+      <w:start w:val="1"/>
+      <w:numFmt w:val="bullet"/>
+      <w:lvlText w:val=""/>
+      <w:lvlJc w:val="left"/>
+      <w:pPr>
+        <w:tabs>
+          <w:tab w:val="num" w:pos="2880"/>
+        </w:tabs>
+        <w:ind w:left="2880" w:hanging="360"/>
+      </w:pPr>
+      <w:rPr>
+        <w:rFonts w:ascii="Symbol" w:hAnsi="Symbol" w:hint="default"/>
+        <w:sz w:val="20"/>
+      </w:rPr>
+    </w:lvl>
+    <w:lvl w:ilvl="4" w:tentative="1">
+      <w:start w:val="1"/>
+      <w:numFmt w:val="bullet"/>
+      <w:lvlText w:val=""/>
+      <w:lvlJc w:val="left"/>
+      <w:pPr>
+        <w:tabs>
+          <w:tab w:val="num" w:pos="3600"/>
+        </w:tabs>
+        <w:ind w:left="3600" w:hanging="360"/>
+      </w:pPr>
+      <w:rPr>
+        <w:rFonts w:ascii="Symbol" w:hAnsi="Symbol" w:hint="default"/>
+        <w:sz w:val="20"/>
+      </w:rPr>
+    </w:lvl>
+    <w:lvl w:ilvl="5" w:tentative="1">
+      <w:start w:val="1"/>
+      <w:numFmt w:val="bullet"/>
+      <w:lvlText w:val=""/>
+      <w:lvlJc w:val="left"/>
+      <w:pPr>
+        <w:tabs>
+          <w:tab w:val="num" w:pos="4320"/>
+        </w:tabs>
+        <w:ind w:left="4320" w:hanging="360"/>
+      </w:pPr>
+      <w:rPr>
+        <w:rFonts w:ascii="Symbol" w:hAnsi="Symbol" w:hint="default"/>
+        <w:sz w:val="20"/>
+      </w:rPr>
+    </w:lvl>
+    <w:lvl w:ilvl="6" w:tentative="1">
+      <w:start w:val="1"/>
+      <w:numFmt w:val="bullet"/>
+      <w:lvlText w:val=""/>
+      <w:lvlJc w:val="left"/>
+      <w:pPr>
+        <w:tabs>
+          <w:tab w:val="num" w:pos="5040"/>
+        </w:tabs>
+        <w:ind w:left="5040" w:hanging="360"/>
+      </w:pPr>
+      <w:rPr>
+        <w:rFonts w:ascii="Symbol" w:hAnsi="Symbol" w:hint="default"/>
+        <w:sz w:val="20"/>
+      </w:rPr>
+    </w:lvl>
+    <w:lvl w:ilvl="7" w:tentative="1">
+      <w:start w:val="1"/>
+      <w:numFmt w:val="bullet"/>
+      <w:lvlText w:val=""/>
+      <w:lvlJc w:val="left"/>
+      <w:pPr>
+        <w:tabs>
+          <w:tab w:val="num" w:pos="5760"/>
+        </w:tabs>
+        <w:ind w:left="5760" w:hanging="360"/>
+      </w:pPr>
+      <w:rPr>
+        <w:rFonts w:ascii="Symbol" w:hAnsi="Symbol" w:hint="default"/>
+        <w:sz w:val="20"/>
+      </w:rPr>
+    </w:lvl>
+    <w:lvl w:ilvl="8" w:tentative="1">
+      <w:start w:val="1"/>
+      <w:numFmt w:val="bullet"/>
+      <w:lvlText w:val=""/>
+      <w:lvlJc w:val="left"/>
+      <w:pPr>
+        <w:tabs>
+          <w:tab w:val="num" w:pos="6480"/>
+        </w:tabs>
+        <w:ind w:left="6480" w:hanging="360"/>
+      </w:pPr>
+      <w:rPr>
+        <w:rFonts w:ascii="Symbol" w:hAnsi="Symbol" w:hint="default"/>
+        <w:sz w:val="20"/>
+      </w:rPr>
+    </w:lvl>
+  </w:abstractNum>
+  <w:abstractNum w:abstractNumId="4" w15:restartNumberingAfterBreak="0">
+    <w:nsid w:val="7BE54276"/>
+    <w:multiLevelType w:val="multilevel"/>
+    <w:tmpl w:val="DD6ABD48"/>
+    <w:lvl w:ilvl="0">
+      <w:start w:val="1"/>
+      <w:numFmt w:val="bullet"/>
+      <w:lvlText w:val=""/>
+      <w:lvlJc w:val="left"/>
+      <w:pPr>
+        <w:tabs>
+          <w:tab w:val="num" w:pos="720"/>
+        </w:tabs>
+        <w:ind w:left="720" w:hanging="360"/>
+      </w:pPr>
+      <w:rPr>
+        <w:rFonts w:ascii="Symbol" w:hAnsi="Symbol" w:hint="default"/>
+        <w:sz w:val="20"/>
+      </w:rPr>
+    </w:lvl>
+    <w:lvl w:ilvl="1">
+      <w:start w:val="1"/>
+      <w:numFmt w:val="bullet"/>
+      <w:lvlText w:val=""/>
+      <w:lvlJc w:val="left"/>
+      <w:pPr>
+        <w:tabs>
+          <w:tab w:val="num" w:pos="1440"/>
+        </w:tabs>
+        <w:ind w:left="1440" w:hanging="360"/>
+      </w:pPr>
+      <w:rPr>
+        <w:rFonts w:ascii="Symbol" w:hAnsi="Symbol" w:hint="default"/>
+        <w:sz w:val="20"/>
+      </w:rPr>
+    </w:lvl>
+    <w:lvl w:ilvl="2">
+      <w:start w:val="1"/>
+      <w:numFmt w:val="bullet"/>
+      <w:lvlText w:val=""/>
+      <w:lvlJc w:val="left"/>
+      <w:pPr>
+        <w:tabs>
+          <w:tab w:val="num" w:pos="2160"/>
+        </w:tabs>
+        <w:ind w:left="2160" w:hanging="360"/>
+      </w:pPr>
+      <w:rPr>
+        <w:rFonts w:ascii="Symbol" w:hAnsi="Symbol" w:hint="default"/>
+        <w:sz w:val="20"/>
+      </w:rPr>
+    </w:lvl>
+    <w:lvl w:ilvl="3" w:tentative="1">
+      <w:start w:val="1"/>
+      <w:numFmt w:val="bullet"/>
+      <w:lvlText w:val=""/>
+      <w:lvlJc w:val="left"/>
+      <w:pPr>
+        <w:tabs>
+          <w:tab w:val="num" w:pos="2880"/>
+        </w:tabs>
+        <w:ind w:left="2880" w:hanging="360"/>
+      </w:pPr>
+      <w:rPr>
+        <w:rFonts w:ascii="Symbol" w:hAnsi="Symbol" w:hint="default"/>
+        <w:sz w:val="20"/>
+      </w:rPr>
+    </w:lvl>
+    <w:lvl w:ilvl="4" w:tentative="1">
+      <w:start w:val="1"/>
+      <w:numFmt w:val="bullet"/>
+      <w:lvlText w:val=""/>
+      <w:lvlJc w:val="left"/>
+      <w:pPr>
+        <w:tabs>
+          <w:tab w:val="num" w:pos="3600"/>
+        </w:tabs>
+        <w:ind w:left="3600" w:hanging="360"/>
+      </w:pPr>
+      <w:rPr>
+        <w:rFonts w:ascii="Symbol" w:hAnsi="Symbol" w:hint="default"/>
+        <w:sz w:val="20"/>
+      </w:rPr>
+    </w:lvl>
+    <w:lvl w:ilvl="5" w:tentative="1">
+      <w:start w:val="1"/>
+      <w:numFmt w:val="bullet"/>
+      <w:lvlText w:val=""/>
+      <w:lvlJc w:val="left"/>
+      <w:pPr>
+        <w:tabs>
+          <w:tab w:val="num" w:pos="4320"/>
+        </w:tabs>
+        <w:ind w:left="4320" w:hanging="360"/>
+      </w:pPr>
+      <w:rPr>
+        <w:rFonts w:ascii="Symbol" w:hAnsi="Symbol" w:hint="default"/>
+        <w:sz w:val="20"/>
+      </w:rPr>
+    </w:lvl>
+    <w:lvl w:ilvl="6" w:tentative="1">
+      <w:start w:val="1"/>
+      <w:numFmt w:val="bullet"/>
+      <w:lvlText w:val=""/>
+      <w:lvlJc w:val="left"/>
+      <w:pPr>
+        <w:tabs>
+          <w:tab w:val="num" w:pos="5040"/>
+        </w:tabs>
+        <w:ind w:left="5040" w:hanging="360"/>
+      </w:pPr>
+      <w:rPr>
+        <w:rFonts w:ascii="Symbol" w:hAnsi="Symbol" w:hint="default"/>
+        <w:sz w:val="20"/>
+      </w:rPr>
+    </w:lvl>
+    <w:lvl w:ilvl="7" w:tentative="1">
+      <w:start w:val="1"/>
+      <w:numFmt w:val="bullet"/>
+      <w:lvlText w:val=""/>
+      <w:lvlJc w:val="left"/>
+      <w:pPr>
+        <w:tabs>
+          <w:tab w:val="num" w:pos="5760"/>
+        </w:tabs>
+        <w:ind w:left="5760" w:hanging="360"/>
+      </w:pPr>
+      <w:rPr>
+        <w:rFonts w:ascii="Symbol" w:hAnsi="Symbol" w:hint="default"/>
+        <w:sz w:val="20"/>
+      </w:rPr>
+    </w:lvl>
+    <w:lvl w:ilvl="8" w:tentative="1">
+      <w:start w:val="1"/>
+      <w:numFmt w:val="bullet"/>
+      <w:lvlText w:val=""/>
+      <w:lvlJc w:val="left"/>
+      <w:pPr>
+        <w:tabs>
+          <w:tab w:val="num" w:pos="6480"/>
+        </w:tabs>
+        <w:ind w:left="6480" w:hanging="360"/>
+      </w:pPr>
+      <w:rPr>
+        <w:rFonts w:ascii="Symbol" w:hAnsi="Symbol" w:hint="default"/>
+        <w:sz w:val="20"/>
+      </w:rPr>
+    </w:lvl>
+  </w:abstractNum>
+  <w:num w:numId="1" w16cid:durableId="1760906571">
+    <w:abstractNumId w:val="0"/>
+  </w:num>
+  <w:num w:numId="2" w16cid:durableId="553811944">
+    <w:abstractNumId w:val="1"/>
+  </w:num>
+  <w:num w:numId="3" w16cid:durableId="2061978545">
+    <w:abstractNumId w:val="4"/>
+  </w:num>
+  <w:num w:numId="4" w16cid:durableId="803544972">
+    <w:abstractNumId w:val="2"/>
+  </w:num>
+  <w:num w:numId="5" w16cid:durableId="1327591426">
+    <w:abstractNumId w:val="3"/>
+  </w:num>
+</w:numbering>
 </file>
 
 <file path=word/styles.xml><?xml version="1.0" encoding="utf-8"?>

</xml_diff>